<commit_message>
Document Vivado simulation and synthesized design
</commit_message>
<xml_diff>
--- a/report/Отчет_ПР1_ПР2_Рябец_Головин_Гришин.docx
+++ b/report/Отчет_ПР1_ПР2_Рябец_Головин_Гришин.docx
@@ -827,6 +827,21 @@
         <w:t>ПРИЛОЖЕНИЕ Б ФРАГМЕНТЫ RTL-МОДЕЛИ</w:t>
         <w:tab/>
         <w:t>26</w:t>
+      </w:r>
+    </w:p>
+    <w:p>
+      <w:pPr>
+        <w:pStyle w:val="ReportContents"/>
+        <w:tabs>
+          <w:tab w:val="clear" w:pos="709"/>
+          <w:tab w:val="right" w:pos="9638" w:leader="dot"/>
+        </w:tabs>
+        <w:rPr/>
+      </w:pPr>
+      <w:r>
+        <w:t>ПРИЛОЖЕНИЕ В ПОДТВЕРЖДЕНИЕ ПРОВЕРКИ В VIVADO</w:t>
+        <w:tab/>
+        <w:t>27</w:t>
       </w:r>
     </w:p>
     <w:p>
@@ -5055,6 +5070,60 @@
           </w:p>
         </w:tc>
       </w:tr>
+      <w:tr>
+        <w:tc>
+          <w:tcPr>
+            <w:tcW w:type="dxa" w:w="2268"/>
+          </w:tcPr>
+          <w:p>
+            <w:pPr>
+              <w:pStyle w:val="ReportTableText"/>
+            </w:pPr>
+            <w:r>
+              <w:t>Vivado XSim, полный набор</w:t>
+            </w:r>
+          </w:p>
+        </w:tc>
+        <w:tc>
+          <w:tcPr>
+            <w:tcW w:type="dxa" w:w="1191"/>
+          </w:tcPr>
+          <w:p>
+            <w:pPr>
+              <w:pStyle w:val="ReportTableText"/>
+            </w:pPr>
+            <w:r>
+              <w:t>2331</w:t>
+            </w:r>
+          </w:p>
+        </w:tc>
+        <w:tc>
+          <w:tcPr>
+            <w:tcW w:type="dxa" w:w="1871"/>
+          </w:tcPr>
+          <w:p>
+            <w:pPr>
+              <w:pStyle w:val="ReportTableText"/>
+            </w:pPr>
+            <w:r>
+              <w:t>0</w:t>
+            </w:r>
+          </w:p>
+        </w:tc>
+        <w:tc>
+          <w:tcPr>
+            <w:tcW w:type="dxa" w:w="3458"/>
+          </w:tcPr>
+          <w:p>
+            <w:pPr>
+              <w:pStyle w:val="ReportTableText"/>
+            </w:pPr>
+            <w:r>
+              <w:t>0 по a_bits и y</w:t>
+            </w:r>
+          </w:p>
+        </w:tc>
+      </w:tr>
     </w:tbl>
     <w:p>
       <w:pPr>
@@ -5070,7 +5139,7 @@
         <w:pStyle w:val="ReportBody"/>
       </w:pPr>
       <w:r>
-        <w:t>Подтверждена поведенческая симуляция в Icarus Verilog. Для Vivado 2022.2 подготовлен проектный Tcl-сценарий, но его запуск в Vivado и синтез не проводились; результаты по ресурсам ПЛИС и таймингам не заявляются.</w:t>
+        <w:t>В Vivado 2022.2 создан проект bnn_pr2 для xc7a100tcsg324-1. Поведенческая симуляция XSim завершилась сообщением PASS: 2331 vectors. Временные диаграммы, результат синтеза и схема приведены в приложении В. Синтез успешно завершился: использовано 629 Slice LUT, 2 Slice Register, 45 Bonded IOB и 1 BUFGCTRL. Оценка ресурсов относится только к синтезу; размещение, трассировка и анализ таймингов не выполнялись.</w:t>
       </w:r>
     </w:p>
     <w:p>
@@ -5090,7 +5159,7 @@
       </w:pPr>
       <w:r>
         <w:rPr/>
-        <w:t>В практических работах № 1–2 создана программная и RTL-модель бинарного классификатора падений 5→8→1. Программная модель обучена на признаках SisFall и дала на тестовой выборке 97,0 % accuracy, 84,5 % precision и 93,6 % recall. RTL-модель повторяет целочисленный тракт: знаковые int8-умножения, 32-битное накопление, бинаризацию, XNOR и popcount. В поведенческой симуляции Icarus Verilog получено полное совпадение с эталоном на 64 контрольных, 2331 тестовых и 14 граничных входах; на полном наборе совпали также промежуточные состояния обоих слоёв. Подготовлены исходники и сценарий проекта для Vivado 2022.2 с целевым кристаллом xc7a100tcsg324-1. Таким образом, системная модель и её функционально проверенный RTL-эквивалент готовы к следующему этапу работы.</w:t>
+        <w:t>В практических работах № 1–2 создана программная и RTL-модель бинарного классификатора падений 5→8→1. Программная модель обучена на признаках SisFall и дала на тестовой выборке 97,0 % accuracy, 84,5 % precision и 93,6 % recall. RTL-модель повторяет целочисленный тракт: знаковые int8-умножения, 32-битное накопление, бинаризацию, XNOR и popcount. В поведенческой симуляции Icarus Verilog получено полное совпадение с эталоном на 64 контрольных, 2331 тестовых и 14 граничных входах; на полном наборе совпали также промежуточные состояния обоих слоёв. В Vivado 2022.2 создан проект для xc7a100tcsg324-1, симуляция XSim прошла 2331 вектор без расхождений, синтез завершился успешно и получена логическая схема. Таким образом, системная модель и её функционально проверенный RTL-эквивалент готовы к следующему этапу работы.</w:t>
       </w:r>
     </w:p>
     <w:p>
@@ -7849,6 +7918,280 @@
         <w:t xml:space="preserve">      - 32'sd8 + $signed(b_b[0]);</w:t>
         <w:br/>
         <w:t>prediction_next = (score &gt;= 32'sd0);</w:t>
+      </w:r>
+    </w:p>
+    <w:p>
+      <w:pPr>
+        <w:pStyle w:val="ReportAppendix"/>
+      </w:pPr>
+      <w:r>
+        <w:t>Приложение В</w:t>
+      </w:r>
+    </w:p>
+    <w:p>
+      <w:pPr>
+        <w:pStyle w:val="ReportAppendixTitle"/>
+      </w:pPr>
+      <w:r>
+        <w:t>Подтверждение проверки в Vivado 2022.2</w:t>
+      </w:r>
+    </w:p>
+    <w:p>
+      <w:pPr>
+        <w:pStyle w:val="ReportBody"/>
+      </w:pPr>
+      <w:r>
+        <w:t>Снимки экрана получены при запуске проекта bnn_pr2 для xc7a100tcsg324-1. Они фиксируют состав проекта, результат поведенческой симуляции, временные диаграммы и синтезированную схему с отчётом использования ресурсов.</w:t>
+      </w:r>
+    </w:p>
+    <w:p>
+      <w:pPr>
+        <w:keepNext/>
+        <w:jc w:val="center"/>
+      </w:pPr>
+      <w:r>
+        <w:drawing>
+          <wp:inline xmlns:a="http://schemas.openxmlformats.org/drawingml/2006/main">
+            <wp:extent cx="5580000" cy="3487500"/>
+            <wp:docPr id="5" name="Picture 5"/>
+            <wp:cNvGraphicFramePr>
+              <a:graphicFrameLocks noChangeAspect="1"/>
+            </wp:cNvGraphicFramePr>
+            <a:graphic>
+              <a:graphicData uri="http://schemas.openxmlformats.org/drawingml/2006/picture">
+                <pic:pic>
+                  <pic:nvPicPr>
+                    <pic:cNvPr id="0" name="vivado_project.jpg"/>
+                    <pic:cNvPicPr/>
+                  </pic:nvPicPr>
+                  <pic:blipFill>
+                    <a:blip r:embed="rId12"/>
+                    <a:stretch>
+                      <a:fillRect/>
+                    </a:stretch>
+                  </pic:blipFill>
+                  <pic:spPr>
+                    <a:xfrm>
+                      <a:off x="0" y="0"/>
+                      <a:ext cx="5580000" cy="3487500"/>
+                    </a:xfrm>
+                    <a:prstGeom prst="rect"/>
+                  </pic:spPr>
+                </pic:pic>
+              </a:graphicData>
+            </a:graphic>
+          </wp:inline>
+        </w:drawing>
+      </w:r>
+    </w:p>
+    <w:p>
+      <w:pPr>
+        <w:pStyle w:val="ReportBody"/>
+        <w:spacing w:after="240"/>
+        <w:jc w:val="center"/>
+      </w:pPr>
+      <w:r>
+        <w:t>Рисунок В.1 — Проект bnn_pr2 и целевой кристалл</w:t>
+      </w:r>
+    </w:p>
+    <w:p>
+      <w:pPr>
+        <w:keepNext/>
+        <w:jc w:val="center"/>
+      </w:pPr>
+      <w:r>
+        <w:drawing>
+          <wp:inline xmlns:a="http://schemas.openxmlformats.org/drawingml/2006/main">
+            <wp:extent cx="5580000" cy="3487500"/>
+            <wp:docPr id="6" name="Picture 6"/>
+            <wp:cNvGraphicFramePr>
+              <a:graphicFrameLocks noChangeAspect="1"/>
+            </wp:cNvGraphicFramePr>
+            <a:graphic>
+              <a:graphicData uri="http://schemas.openxmlformats.org/drawingml/2006/picture">
+                <pic:pic>
+                  <pic:nvPicPr>
+                    <pic:cNvPr id="0" name="vivado_simulation_pass.jpg"/>
+                    <pic:cNvPicPr/>
+                  </pic:nvPicPr>
+                  <pic:blipFill>
+                    <a:blip r:embed="rId13"/>
+                    <a:stretch>
+                      <a:fillRect/>
+                    </a:stretch>
+                  </pic:blipFill>
+                  <pic:spPr>
+                    <a:xfrm>
+                      <a:off x="0" y="0"/>
+                      <a:ext cx="5580000" cy="3487500"/>
+                    </a:xfrm>
+                    <a:prstGeom prst="rect"/>
+                  </pic:spPr>
+                </pic:pic>
+              </a:graphicData>
+            </a:graphic>
+          </wp:inline>
+        </w:drawing>
+      </w:r>
+    </w:p>
+    <w:p>
+      <w:pPr>
+        <w:pStyle w:val="ReportBody"/>
+        <w:spacing w:after="240"/>
+        <w:jc w:val="center"/>
+      </w:pPr>
+      <w:r>
+        <w:t>Рисунок В.2 — Успешная симуляция 2331 эталонного вектора</w:t>
+      </w:r>
+    </w:p>
+    <w:p>
+      <w:pPr>
+        <w:keepNext/>
+        <w:jc w:val="center"/>
+      </w:pPr>
+      <w:r>
+        <w:drawing>
+          <wp:inline xmlns:a="http://schemas.openxmlformats.org/drawingml/2006/main">
+            <wp:extent cx="5580000" cy="3487500"/>
+            <wp:docPr id="7" name="Picture 7"/>
+            <wp:cNvGraphicFramePr>
+              <a:graphicFrameLocks noChangeAspect="1"/>
+            </wp:cNvGraphicFramePr>
+            <a:graphic>
+              <a:graphicData uri="http://schemas.openxmlformats.org/drawingml/2006/picture">
+                <pic:pic>
+                  <pic:nvPicPr>
+                    <pic:cNvPr id="0" name="vivado_waveform.jpg"/>
+                    <pic:cNvPicPr/>
+                  </pic:nvPicPr>
+                  <pic:blipFill>
+                    <a:blip r:embed="rId14"/>
+                    <a:stretch>
+                      <a:fillRect/>
+                    </a:stretch>
+                  </pic:blipFill>
+                  <pic:spPr>
+                    <a:xfrm>
+                      <a:off x="0" y="0"/>
+                      <a:ext cx="5580000" cy="3487500"/>
+                    </a:xfrm>
+                    <a:prstGeom prst="rect"/>
+                  </pic:spPr>
+                </pic:pic>
+              </a:graphicData>
+            </a:graphic>
+          </wp:inline>
+        </w:drawing>
+      </w:r>
+    </w:p>
+    <w:p>
+      <w:pPr>
+        <w:pStyle w:val="ReportBody"/>
+        <w:spacing w:after="240"/>
+        <w:jc w:val="center"/>
+      </w:pPr>
+      <w:r>
+        <w:t>Рисунок В.3 — Временные диаграммы входов и выходов RTL-модели</w:t>
+      </w:r>
+    </w:p>
+    <w:p>
+      <w:pPr>
+        <w:keepNext/>
+        <w:jc w:val="center"/>
+      </w:pPr>
+      <w:r>
+        <w:drawing>
+          <wp:inline xmlns:a="http://schemas.openxmlformats.org/drawingml/2006/main">
+            <wp:extent cx="5580000" cy="3487500"/>
+            <wp:docPr id="8" name="Picture 8"/>
+            <wp:cNvGraphicFramePr>
+              <a:graphicFrameLocks noChangeAspect="1"/>
+            </wp:cNvGraphicFramePr>
+            <a:graphic>
+              <a:graphicData uri="http://schemas.openxmlformats.org/drawingml/2006/picture">
+                <pic:pic>
+                  <pic:nvPicPr>
+                    <pic:cNvPr id="0" name="vivado_synthesized_schematic.jpg"/>
+                    <pic:cNvPicPr/>
+                  </pic:nvPicPr>
+                  <pic:blipFill>
+                    <a:blip r:embed="rId15"/>
+                    <a:stretch>
+                      <a:fillRect/>
+                    </a:stretch>
+                  </pic:blipFill>
+                  <pic:spPr>
+                    <a:xfrm>
+                      <a:off x="0" y="0"/>
+                      <a:ext cx="5580000" cy="3487500"/>
+                    </a:xfrm>
+                    <a:prstGeom prst="rect"/>
+                  </pic:spPr>
+                </pic:pic>
+              </a:graphicData>
+            </a:graphic>
+          </wp:inline>
+        </w:drawing>
+      </w:r>
+    </w:p>
+    <w:p>
+      <w:pPr>
+        <w:pStyle w:val="ReportBody"/>
+        <w:spacing w:after="240"/>
+        <w:jc w:val="center"/>
+      </w:pPr>
+      <w:r>
+        <w:t>Рисунок В.4 — Общий вид синтезированной логической схемы</w:t>
+      </w:r>
+    </w:p>
+    <w:p>
+      <w:pPr>
+        <w:keepNext/>
+        <w:jc w:val="center"/>
+      </w:pPr>
+      <w:r>
+        <w:drawing>
+          <wp:inline xmlns:a="http://schemas.openxmlformats.org/drawingml/2006/main">
+            <wp:extent cx="5580000" cy="3487500"/>
+            <wp:docPr id="9" name="Picture 9"/>
+            <wp:cNvGraphicFramePr>
+              <a:graphicFrameLocks noChangeAspect="1"/>
+            </wp:cNvGraphicFramePr>
+            <a:graphic>
+              <a:graphicData uri="http://schemas.openxmlformats.org/drawingml/2006/picture">
+                <pic:pic>
+                  <pic:nvPicPr>
+                    <pic:cNvPr id="0" name="vivado_utilization.jpg"/>
+                    <pic:cNvPicPr/>
+                  </pic:nvPicPr>
+                  <pic:blipFill>
+                    <a:blip r:embed="rId16"/>
+                    <a:stretch>
+                      <a:fillRect/>
+                    </a:stretch>
+                  </pic:blipFill>
+                  <pic:spPr>
+                    <a:xfrm>
+                      <a:off x="0" y="0"/>
+                      <a:ext cx="5580000" cy="3487500"/>
+                    </a:xfrm>
+                    <a:prstGeom prst="rect"/>
+                  </pic:spPr>
+                </pic:pic>
+              </a:graphicData>
+            </a:graphic>
+          </wp:inline>
+        </w:drawing>
+      </w:r>
+    </w:p>
+    <w:p>
+      <w:pPr>
+        <w:pStyle w:val="ReportBody"/>
+        <w:spacing w:after="240"/>
+        <w:jc w:val="center"/>
+      </w:pPr>
+      <w:r>
+        <w:t>Рисунок В.5 — Фрагмент схемы и использование ресурсов после синтеза</w:t>
       </w:r>
     </w:p>
     <w:sectPr>

</xml_diff>

<commit_message>
Include complete Verilog and testbench listings in report
</commit_message>
<xml_diff>
--- a/report/Отчет_ПР1_ПР2_Рябец_Головин_Гришин.docx
+++ b/report/Отчет_ПР1_ПР2_Рябец_Головин_Гришин.docx
@@ -824,7 +824,7 @@
         <w:rPr/>
       </w:pPr>
       <w:r>
-        <w:t>ПРИЛОЖЕНИЕ Б ФРАГМЕНТЫ RTL-МОДЕЛИ</w:t>
+        <w:t>ПРИЛОЖЕНИЕ Б ИСХОДНЫЙ КОД RTL-МОДЕЛИ</w:t>
         <w:tab/>
         <w:t>28</w:t>
       </w:r>
@@ -7977,7 +7977,7 @@
         <w:pStyle w:val="ReportAppendixTitle"/>
       </w:pPr>
       <w:r>
-        <w:t>Ключевые фрагменты RTL-модели</w:t>
+        <w:t>Исходный код RTL-модели</w:t>
       </w:r>
     </w:p>
     <w:p>
@@ -7985,7 +7985,7 @@
         <w:pStyle w:val="ReportBody"/>
       </w:pPr>
       <w:r>
-        <w:t>Ниже приведены операции, определяющие совпадение RTL-модели с целочисленным эталоном.</w:t>
+        <w:t>Приведён полный код классификатора и самопроверяющегося тестбенча, использованных в симуляции. Комментарии опущены.</w:t>
       </w:r>
     </w:p>
     <w:p>
@@ -7993,35 +7993,7 @@
         <w:pStyle w:val="ReportListingCaption"/>
       </w:pPr>
       <w:r>
-        <w:t>Листинг Б.1 — Знаковое накопление и бинаризация слоя A</w:t>
-      </w:r>
-    </w:p>
-    <w:p>
-      <w:pPr>
-        <w:pStyle w:val="ReportCode"/>
-      </w:pPr>
-      <w:r>
-        <w:t>accumulator = $signed(b_a[h]);</w:t>
-        <w:br/>
-        <w:t>for (j = 0; j &lt; 5; j = j + 1) begin</w:t>
-        <w:br/>
-        <w:t xml:space="preserve">    product = $signed(input_features[39 - 8*j -: 8])</w:t>
-        <w:br/>
-        <w:t xml:space="preserve">            * $signed(w_a[j*8 + h]);</w:t>
-        <w:br/>
-        <w:t xml:space="preserve">    accumulator = accumulator + {{16{product[15]}}, product};</w:t>
-        <w:br/>
-        <w:t>end</w:t>
-        <w:br/>
-        <w:t>hidden_bits[h] = (accumulator &gt;= 32'sd0);</w:t>
-      </w:r>
-    </w:p>
-    <w:p>
-      <w:pPr>
-        <w:pStyle w:val="ReportListingCaption"/>
-      </w:pPr>
-      <w:r>
-        <w:t>Листинг Б.2 — XNOR, popcount и пороговое решение</w:t>
+        <w:t>Листинг Б.1 — RTL-модуль классификатора</w:t>
       </w:r>
     </w:p>
     <w:p>
@@ -8032,15 +8004,381 @@
         <w:rPr>
           <w:sz w:val="18"/>
         </w:rPr>
-        <w:t>for (h = 0; h &lt; 8; h = h + 1)</w:t>
-        <w:br/>
-        <w:t xml:space="preserve">    matching_bits = matching_bits + (hidden_bits[h] ~^ w_b[h]);</w:t>
-        <w:br/>
-        <w:t>score = ($signed({28'b0, matching_bits}) &lt;&lt;&lt; 1)</w:t>
-        <w:br/>
-        <w:t xml:space="preserve">      - 32'sd8 + $signed(b_b[0]);</w:t>
-        <w:br/>
-        <w:t>prediction_next = (score &gt;= 32'sd0);</w:t>
+        <w:t>`timescale 1ns / 1ps</w:t>
+        <w:br/>
+        <w:br/>
+        <w:t>module bnn_classifier #(</w:t>
+        <w:br/>
+        <w:t xml:space="preserve">    parameter W_A_FILE = "weights_layerA_W.mem",</w:t>
+        <w:br/>
+        <w:t xml:space="preserve">    parameter B_A_FILE = "weights_layerA_b.mem",</w:t>
+        <w:br/>
+        <w:t xml:space="preserve">    parameter W_B_FILE = "weights_layerB_W.mem",</w:t>
+        <w:br/>
+        <w:t xml:space="preserve">    parameter B_B_FILE = "weights_layerB_b.mem"</w:t>
+        <w:br/>
+        <w:t>) (</w:t>
+        <w:br/>
+        <w:t xml:space="preserve">    input  wire        clk,</w:t>
+        <w:br/>
+        <w:t xml:space="preserve">    input  wire        rst_n,</w:t>
+        <w:br/>
+        <w:t xml:space="preserve">    input  wire        valid_in,</w:t>
+        <w:br/>
+        <w:t xml:space="preserve">    input  wire [39:0] input_features,</w:t>
+        <w:br/>
+        <w:t xml:space="preserve">    output reg         valid_out,</w:t>
+        <w:br/>
+        <w:t xml:space="preserve">    output reg         fall_detected</w:t>
+        <w:br/>
+        <w:t>);</w:t>
+        <w:br/>
+        <w:t xml:space="preserve">    reg [7:0]  w_a [0:39];</w:t>
+        <w:br/>
+        <w:t xml:space="preserve">    reg [31:0] b_a [0:7];</w:t>
+        <w:br/>
+        <w:t xml:space="preserve">    reg        w_b [0:7];</w:t>
+        <w:br/>
+        <w:t xml:space="preserve">    reg [31:0] b_b [0:0];</w:t>
+        <w:br/>
+        <w:br/>
+        <w:t xml:space="preserve">    initial begin</w:t>
+        <w:br/>
+        <w:t xml:space="preserve">        $readmemh(W_A_FILE, w_a);</w:t>
+        <w:br/>
+        <w:t xml:space="preserve">        $readmemh(B_A_FILE, b_a);</w:t>
+        <w:br/>
+        <w:t xml:space="preserve">        $readmemh(W_B_FILE, w_b);</w:t>
+        <w:br/>
+        <w:t xml:space="preserve">        $readmemh(B_B_FILE, b_b);</w:t>
+        <w:br/>
+        <w:t xml:space="preserve">    end</w:t>
+        <w:br/>
+        <w:br/>
+        <w:t xml:space="preserve">    reg signed [15:0] product;</w:t>
+        <w:br/>
+        <w:t xml:space="preserve">    reg signed [31:0] accumulator;</w:t>
+        <w:br/>
+        <w:t xml:space="preserve">    reg [7:0] hidden_bits;</w:t>
+        <w:br/>
+        <w:t xml:space="preserve">    reg [3:0] matching_bits;</w:t>
+        <w:br/>
+        <w:t xml:space="preserve">    reg signed [31:0] score;</w:t>
+        <w:br/>
+        <w:t xml:space="preserve">    reg prediction_next;</w:t>
+        <w:br/>
+        <w:t xml:space="preserve">    integer h;</w:t>
+        <w:br/>
+        <w:t xml:space="preserve">    integer j;</w:t>
+        <w:br/>
+        <w:br/>
+        <w:t xml:space="preserve">    always @* begin</w:t>
+        <w:br/>
+        <w:t xml:space="preserve">        product = 16'sd0;</w:t>
+        <w:br/>
+        <w:t xml:space="preserve">        accumulator = 32'sd0;</w:t>
+        <w:br/>
+        <w:t xml:space="preserve">        hidden_bits = 8'b0;</w:t>
+        <w:br/>
+        <w:t xml:space="preserve">        matching_bits = 4'b0;</w:t>
+        <w:br/>
+        <w:t xml:space="preserve">        score = 32'sd0;</w:t>
+        <w:br/>
+        <w:t xml:space="preserve">        prediction_next = 1'b0;</w:t>
+        <w:br/>
+        <w:br/>
+        <w:t xml:space="preserve">        for (h = 0; h &lt; 8; h = h + 1) begin</w:t>
+        <w:br/>
+        <w:t xml:space="preserve">            accumulator = $signed(b_a[h]);</w:t>
+        <w:br/>
+        <w:t xml:space="preserve">            for (j = 0; j &lt; 5; j = j + 1) begin</w:t>
+        <w:br/>
+        <w:t xml:space="preserve">                product = $signed(input_features[39 - 8*j -: 8])</w:t>
+        <w:br/>
+        <w:t xml:space="preserve">                        * $signed(w_a[j*8 + h]);</w:t>
+        <w:br/>
+        <w:t xml:space="preserve">                accumulator = accumulator + {{16{product[15]}}, product};</w:t>
+        <w:br/>
+        <w:t xml:space="preserve">            end</w:t>
+        <w:br/>
+        <w:t xml:space="preserve">            hidden_bits[h] = (accumulator &gt;= 32'sd0);</w:t>
+        <w:br/>
+        <w:t xml:space="preserve">        end</w:t>
+        <w:br/>
+        <w:br/>
+        <w:t xml:space="preserve">        for (h = 0; h &lt; 8; h = h + 1)</w:t>
+        <w:br/>
+        <w:t xml:space="preserve">            matching_bits = matching_bits + (hidden_bits[h] ~^ w_b[h]);</w:t>
+        <w:br/>
+        <w:br/>
+        <w:t xml:space="preserve">        score = ($signed({28'b0, matching_bits}) &lt;&lt;&lt; 1)</w:t>
+        <w:br/>
+        <w:t xml:space="preserve">              - 32'sd8 + $signed(b_b[0]);</w:t>
+        <w:br/>
+        <w:t xml:space="preserve">        prediction_next = (score &gt;= 32'sd0);</w:t>
+        <w:br/>
+        <w:t xml:space="preserve">    end</w:t>
+        <w:br/>
+        <w:br/>
+        <w:t xml:space="preserve">    always @(posedge clk) begin</w:t>
+        <w:br/>
+        <w:t xml:space="preserve">        if (!rst_n) begin</w:t>
+        <w:br/>
+        <w:t xml:space="preserve">            valid_out &lt;= 1'b0;</w:t>
+        <w:br/>
+        <w:t xml:space="preserve">            fall_detected &lt;= 1'b0;</w:t>
+        <w:br/>
+        <w:t xml:space="preserve">        end else begin</w:t>
+        <w:br/>
+        <w:t xml:space="preserve">            valid_out &lt;= valid_in;</w:t>
+        <w:br/>
+        <w:t xml:space="preserve">            if (valid_in)</w:t>
+        <w:br/>
+        <w:t xml:space="preserve">                fall_detected &lt;= prediction_next;</w:t>
+        <w:br/>
+        <w:t xml:space="preserve">        end</w:t>
+        <w:br/>
+        <w:t xml:space="preserve">    end</w:t>
+        <w:br/>
+        <w:t>endmodule</w:t>
+      </w:r>
+    </w:p>
+    <w:p>
+      <w:pPr>
+        <w:pStyle w:val="ReportListingCaption"/>
+      </w:pPr>
+      <w:r>
+        <w:t>Листинг Б.2 — Самопроверяющийся тестбенч</w:t>
+      </w:r>
+    </w:p>
+    <w:p>
+      <w:pPr>
+        <w:pStyle w:val="ReportCode"/>
+      </w:pPr>
+      <w:r>
+        <w:rPr>
+          <w:sz w:val="18"/>
+        </w:rPr>
+        <w:t>`timescale 1ns / 1ps</w:t>
+        <w:br/>
+        <w:br/>
+        <w:t>module tb_bnn_classifier;</w:t>
+        <w:br/>
+        <w:t>`ifdef FULL_TEST</w:t>
+        <w:br/>
+        <w:t xml:space="preserve">    localparam VECTOR_COUNT = 2331;</w:t>
+        <w:br/>
+        <w:t>`elsif EDGE_TEST</w:t>
+        <w:br/>
+        <w:t xml:space="preserve">    localparam VECTOR_COUNT = 14;</w:t>
+        <w:br/>
+        <w:t>`else</w:t>
+        <w:br/>
+        <w:t xml:space="preserve">    localparam VECTOR_COUNT = 64;</w:t>
+        <w:br/>
+        <w:t>`endif</w:t>
+        <w:br/>
+        <w:br/>
+        <w:t xml:space="preserve">    reg clk = 1'b0;</w:t>
+        <w:br/>
+        <w:t xml:space="preserve">    always #5 clk = ~clk;</w:t>
+        <w:br/>
+        <w:br/>
+        <w:t xml:space="preserve">    reg rst_n = 1'b0;</w:t>
+        <w:br/>
+        <w:t xml:space="preserve">    reg valid_in = 1'b0;</w:t>
+        <w:br/>
+        <w:t xml:space="preserve">    reg [39:0] input_features = 40'b0;</w:t>
+        <w:br/>
+        <w:t xml:space="preserve">    wire valid_out;</w:t>
+        <w:br/>
+        <w:t xml:space="preserve">    wire fall_detected;</w:t>
+        <w:br/>
+        <w:br/>
+        <w:t xml:space="preserve">    reg [39:0] vectors [0:VECTOR_COUNT-1];</w:t>
+        <w:br/>
+        <w:t xml:space="preserve">    reg expected [0:VECTOR_COUNT-1];</w:t>
+        <w:br/>
+        <w:t>`ifdef FULL_TEST</w:t>
+        <w:br/>
+        <w:t xml:space="preserve">    reg [7:0] expected_hidden [0:VECTOR_COUNT-1];</w:t>
+        <w:br/>
+        <w:t xml:space="preserve">    reg [31:0] expected_score [0:VECTOR_COUNT-1];</w:t>
+        <w:br/>
+        <w:t>`elsif EDGE_TEST</w:t>
+        <w:br/>
+        <w:t xml:space="preserve">    reg [7:0] expected_hidden [0:VECTOR_COUNT-1];</w:t>
+        <w:br/>
+        <w:t xml:space="preserve">    reg [31:0] expected_score [0:VECTOR_COUNT-1];</w:t>
+        <w:br/>
+        <w:t>`endif</w:t>
+        <w:br/>
+        <w:br/>
+        <w:t xml:space="preserve">    integer i;</w:t>
+        <w:br/>
+        <w:t xml:space="preserve">    integer errors;</w:t>
+        <w:br/>
+        <w:br/>
+        <w:t xml:space="preserve">    bnn_classifier dut (</w:t>
+        <w:br/>
+        <w:t xml:space="preserve">        .clk(clk),</w:t>
+        <w:br/>
+        <w:t xml:space="preserve">        .rst_n(rst_n),</w:t>
+        <w:br/>
+        <w:t xml:space="preserve">        .valid_in(valid_in),</w:t>
+        <w:br/>
+        <w:t xml:space="preserve">        .input_features(input_features),</w:t>
+        <w:br/>
+        <w:t xml:space="preserve">        .valid_out(valid_out),</w:t>
+        <w:br/>
+        <w:t xml:space="preserve">        .fall_detected(fall_detected)</w:t>
+        <w:br/>
+        <w:t xml:space="preserve">    );</w:t>
+        <w:br/>
+        <w:br/>
+        <w:t xml:space="preserve">    initial begin</w:t>
+        <w:br/>
+        <w:t>`ifdef FULL_TEST</w:t>
+        <w:br/>
+        <w:t xml:space="preserve">        $readmemh("tb_inputs_full.mem", vectors);</w:t>
+        <w:br/>
+        <w:t xml:space="preserve">        $readmemh("tb_expected_full.mem", expected);</w:t>
+        <w:br/>
+        <w:t xml:space="preserve">        $readmemh("tb_hidden_full.mem", expected_hidden);</w:t>
+        <w:br/>
+        <w:t xml:space="preserve">        $readmemh("tb_score_full.mem", expected_score);</w:t>
+        <w:br/>
+        <w:t>`elsif EDGE_TEST</w:t>
+        <w:br/>
+        <w:t xml:space="preserve">        $readmemh("tb_inputs_edge.mem", vectors);</w:t>
+        <w:br/>
+        <w:t xml:space="preserve">        $readmemh("tb_expected_edge.mem", expected);</w:t>
+        <w:br/>
+        <w:t xml:space="preserve">        $readmemh("tb_hidden_edge.mem", expected_hidden);</w:t>
+        <w:br/>
+        <w:t xml:space="preserve">        $readmemh("tb_score_edge.mem", expected_score);</w:t>
+        <w:br/>
+        <w:t>`else</w:t>
+        <w:br/>
+        <w:t xml:space="preserve">        $readmemh("tb_inputs_64.mem", vectors);</w:t>
+        <w:br/>
+        <w:t xml:space="preserve">        $readmemh("tb_expected_64.mem", expected);</w:t>
+        <w:br/>
+        <w:t>`endif</w:t>
+        <w:br/>
+        <w:br/>
+        <w:t xml:space="preserve">        errors = 0;</w:t>
+        <w:br/>
+        <w:t xml:space="preserve">        repeat (2) @(negedge clk);</w:t>
+        <w:br/>
+        <w:t xml:space="preserve">        if (valid_out !== 1'b0 || fall_detected !== 1'b0)</w:t>
+        <w:br/>
+        <w:t xml:space="preserve">            $fatal(1, "synchronous reset did not clear outputs");</w:t>
+        <w:br/>
+        <w:t xml:space="preserve">        rst_n = 1'b1;</w:t>
+        <w:br/>
+        <w:br/>
+        <w:t xml:space="preserve">        for (i = 0; i &lt; VECTOR_COUNT; i = i + 1) begin</w:t>
+        <w:br/>
+        <w:t xml:space="preserve">            @(negedge clk);</w:t>
+        <w:br/>
+        <w:t xml:space="preserve">            input_features = vectors[i];</w:t>
+        <w:br/>
+        <w:t xml:space="preserve">            valid_in = 1'b1;</w:t>
+        <w:br/>
+        <w:t xml:space="preserve">            #1;</w:t>
+        <w:br/>
+        <w:t>`ifdef FULL_TEST</w:t>
+        <w:br/>
+        <w:t xml:space="preserve">            if (dut.hidden_bits !== expected_hidden[i]) begin</w:t>
+        <w:br/>
+        <w:t xml:space="preserve">                $display("FAIL vector %0d: hidden=%02h expected=%02h",</w:t>
+        <w:br/>
+        <w:t xml:space="preserve">                         i, dut.hidden_bits, expected_hidden[i]);</w:t>
+        <w:br/>
+        <w:t xml:space="preserve">                errors = errors + 1;</w:t>
+        <w:br/>
+        <w:t xml:space="preserve">            end</w:t>
+        <w:br/>
+        <w:t xml:space="preserve">            if (dut.score !== $signed(expected_score[i])) begin</w:t>
+        <w:br/>
+        <w:t xml:space="preserve">                $display("FAIL vector %0d: score=%0d expected=%0d",</w:t>
+        <w:br/>
+        <w:t xml:space="preserve">                         i, dut.score, $signed(expected_score[i]));</w:t>
+        <w:br/>
+        <w:t xml:space="preserve">                errors = errors + 1;</w:t>
+        <w:br/>
+        <w:t xml:space="preserve">            end</w:t>
+        <w:br/>
+        <w:t>`elsif EDGE_TEST</w:t>
+        <w:br/>
+        <w:t xml:space="preserve">            if (dut.hidden_bits !== expected_hidden[i]) begin</w:t>
+        <w:br/>
+        <w:t xml:space="preserve">                $display("FAIL edge %0d: hidden=%02h expected=%02h",</w:t>
+        <w:br/>
+        <w:t xml:space="preserve">                         i, dut.hidden_bits, expected_hidden[i]);</w:t>
+        <w:br/>
+        <w:t xml:space="preserve">                errors = errors + 1;</w:t>
+        <w:br/>
+        <w:t xml:space="preserve">            end</w:t>
+        <w:br/>
+        <w:t xml:space="preserve">            if (dut.score !== $signed(expected_score[i])) begin</w:t>
+        <w:br/>
+        <w:t xml:space="preserve">                $display("FAIL edge %0d: score=%0d expected=%0d",</w:t>
+        <w:br/>
+        <w:t xml:space="preserve">                         i, dut.score, $signed(expected_score[i]));</w:t>
+        <w:br/>
+        <w:t xml:space="preserve">                errors = errors + 1;</w:t>
+        <w:br/>
+        <w:t xml:space="preserve">            end</w:t>
+        <w:br/>
+        <w:t>`endif</w:t>
+        <w:br/>
+        <w:t xml:space="preserve">            @(posedge clk);</w:t>
+        <w:br/>
+        <w:t xml:space="preserve">            #1;</w:t>
+        <w:br/>
+        <w:t xml:space="preserve">            if (valid_out !== 1'b1 || fall_detected !== expected[i]) begin</w:t>
+        <w:br/>
+        <w:t xml:space="preserve">                $display("FAIL vector %0d: valid=%b output=%b expected=%b",</w:t>
+        <w:br/>
+        <w:t xml:space="preserve">                         i, valid_out, fall_detected, expected[i]);</w:t>
+        <w:br/>
+        <w:t xml:space="preserve">                errors = errors + 1;</w:t>
+        <w:br/>
+        <w:t xml:space="preserve">            end</w:t>
+        <w:br/>
+        <w:t xml:space="preserve">        end</w:t>
+        <w:br/>
+        <w:br/>
+        <w:t xml:space="preserve">        @(negedge clk);</w:t>
+        <w:br/>
+        <w:t xml:space="preserve">        valid_in = 1'b0;</w:t>
+        <w:br/>
+        <w:t xml:space="preserve">        @(posedge clk);</w:t>
+        <w:br/>
+        <w:t xml:space="preserve">        #1;</w:t>
+        <w:br/>
+        <w:t xml:space="preserve">        if (valid_out !== 1'b0) begin</w:t>
+        <w:br/>
+        <w:t xml:space="preserve">            $display("FAIL: valid_out did not clear after valid_in");</w:t>
+        <w:br/>
+        <w:t xml:space="preserve">            errors = errors + 1;</w:t>
+        <w:br/>
+        <w:t xml:space="preserve">        end</w:t>
+        <w:br/>
+        <w:br/>
+        <w:t xml:space="preserve">        if (errors != 0)</w:t>
+        <w:br/>
+        <w:t xml:space="preserve">            $fatal(1, "%0d failures in %0d vectors", errors, VECTOR_COUNT);</w:t>
+        <w:br/>
+        <w:t xml:space="preserve">        $display("PASS: %0d vectors; output, valid signal and golden model agree", VECTOR_COUNT);</w:t>
+        <w:br/>
+        <w:t xml:space="preserve">        $finish;</w:t>
+        <w:br/>
+        <w:t xml:space="preserve">    end</w:t>
+        <w:br/>
+        <w:t>endmodule</w:t>
       </w:r>
     </w:p>
     <w:sectPr>

</xml_diff>